<commit_message>
new prompts for scoring
</commit_message>
<xml_diff>
--- a/documentation/kredo score pytania 1,0.docx
+++ b/documentation/kredo score pytania 1,0.docx
@@ -25,10 +25,7 @@
       </w:r>
       <w:proofErr w:type="spellEnd"/>
       <w:r>
-        <w:t xml:space="preserve">. </w:t>
-      </w:r>
-      <w:r>
-        <w:t xml:space="preserve">      "raw": {</w:t>
+        <w:t>.       "raw": {</w:t>
       </w:r>
     </w:p>
     <w:p>
@@ -262,7 +259,7 @@
       </w:r>
       <w:r>
         <w:rPr>
-          <w:lang w:val="pl-PL"/>
+          <w:lang w:val="ru-RU"/>
         </w:rPr>
         <w:br/>
       </w:r>
@@ -281,29 +278,40 @@
     </w:p>
     <w:p/>
     <w:p>
-      <w:pPr>
-        <w:rPr>
-          <w:lang w:val="pl-PL"/>
-        </w:rPr>
-      </w:pPr>
+      <w:r>
+        <w:t xml:space="preserve">4_01_ </w:t>
+      </w:r>
+      <w:proofErr w:type="spellStart"/>
       <w:r>
         <w:rPr>
           <w:lang w:val="ru-RU"/>
         </w:rPr>
-        <w:t xml:space="preserve">4_01_ </w:t>
+        <w:t>Чи</w:t>
+      </w:r>
+      <w:proofErr w:type="spellEnd"/>
+      <w:r>
+        <w:t xml:space="preserve"> </w:t>
       </w:r>
       <w:proofErr w:type="spellStart"/>
       <w:r>
         <w:rPr>
           <w:lang w:val="ru-RU"/>
         </w:rPr>
-        <w:t>Чи</w:t>
-      </w:r>
-      <w:proofErr w:type="spellEnd"/>
+        <w:t>зробив</w:t>
+      </w:r>
+      <w:proofErr w:type="spellEnd"/>
+      <w:r>
+        <w:t xml:space="preserve"> </w:t>
+      </w:r>
+      <w:proofErr w:type="spellStart"/>
       <w:r>
         <w:rPr>
           <w:lang w:val="ru-RU"/>
         </w:rPr>
+        <w:t>фахівець</w:t>
+      </w:r>
+      <w:proofErr w:type="spellEnd"/>
+      <w:r>
         <w:t xml:space="preserve"> </w:t>
       </w:r>
       <w:proofErr w:type="spellStart"/>
@@ -311,13 +319,21 @@
         <w:rPr>
           <w:lang w:val="ru-RU"/>
         </w:rPr>
-        <w:t>зробив</w:t>
-      </w:r>
-      <w:proofErr w:type="spellEnd"/>
+        <w:t>деталізованний</w:t>
+      </w:r>
+      <w:proofErr w:type="spellEnd"/>
+      <w:r>
+        <w:t xml:space="preserve"> </w:t>
+      </w:r>
+      <w:proofErr w:type="spellStart"/>
       <w:r>
         <w:rPr>
           <w:lang w:val="ru-RU"/>
         </w:rPr>
+        <w:t>підсумок</w:t>
+      </w:r>
+      <w:proofErr w:type="spellEnd"/>
+      <w:r>
         <w:t xml:space="preserve"> </w:t>
       </w:r>
       <w:proofErr w:type="spellStart"/>
@@ -325,13 +341,19 @@
         <w:rPr>
           <w:lang w:val="ru-RU"/>
         </w:rPr>
-        <w:t>фахівець</w:t>
-      </w:r>
-      <w:proofErr w:type="spellEnd"/>
+        <w:t>розмови</w:t>
+      </w:r>
+      <w:proofErr w:type="spellEnd"/>
+      <w:r>
+        <w:t xml:space="preserve"> </w:t>
+      </w:r>
       <w:r>
         <w:rPr>
           <w:lang w:val="ru-RU"/>
         </w:rPr>
+        <w:t>в</w:t>
+      </w:r>
+      <w:r>
         <w:t xml:space="preserve"> </w:t>
       </w:r>
       <w:proofErr w:type="spellStart"/>
@@ -339,55 +361,10 @@
         <w:rPr>
           <w:lang w:val="ru-RU"/>
         </w:rPr>
-        <w:t>деталізованний</w:t>
-      </w:r>
-      <w:proofErr w:type="spellEnd"/>
-      <w:r>
-        <w:rPr>
-          <w:lang w:val="ru-RU"/>
-        </w:rPr>
-        <w:t xml:space="preserve"> </w:t>
-      </w:r>
-      <w:proofErr w:type="spellStart"/>
-      <w:r>
-        <w:rPr>
-          <w:lang w:val="ru-RU"/>
-        </w:rPr>
-        <w:t>підсумок</w:t>
-      </w:r>
-      <w:proofErr w:type="spellEnd"/>
-      <w:r>
-        <w:rPr>
-          <w:lang w:val="ru-RU"/>
-        </w:rPr>
-        <w:t xml:space="preserve"> </w:t>
-      </w:r>
-      <w:proofErr w:type="spellStart"/>
-      <w:r>
-        <w:rPr>
-          <w:lang w:val="ru-RU"/>
-        </w:rPr>
-        <w:t>розмови</w:t>
-      </w:r>
-      <w:proofErr w:type="spellEnd"/>
-      <w:r>
-        <w:rPr>
-          <w:lang w:val="ru-RU"/>
-        </w:rPr>
-        <w:t xml:space="preserve"> в </w:t>
-      </w:r>
-      <w:proofErr w:type="spellStart"/>
-      <w:r>
-        <w:rPr>
-          <w:lang w:val="ru-RU"/>
-        </w:rPr>
         <w:t>кінці</w:t>
       </w:r>
       <w:proofErr w:type="spellEnd"/>
       <w:r>
-        <w:rPr>
-          <w:lang w:val="ru-RU"/>
-        </w:rPr>
         <w:t>?</w:t>
       </w:r>
     </w:p>
@@ -2157,6 +2134,7 @@
   <w:style w:type="character" w:default="1" w:styleId="Domylnaczcionkaakapitu">
     <w:name w:val="Default Paragraph Font"/>
     <w:uiPriority w:val="1"/>
+    <w:semiHidden/>
     <w:unhideWhenUsed/>
   </w:style>
   <w:style w:type="table" w:default="1" w:styleId="Standardowy">

</xml_diff>